<commit_message>
all llms implementation generated
</commit_message>
<xml_diff>
--- a/Prompts/Prompts_OpenAI.docx
+++ b/Prompts/Prompts_OpenAI.docx
@@ -115,8 +115,20 @@
     <w:p/>
     <w:p/>
     <w:p/>
-    <w:p/>
-    <w:p/>
+    <w:p>
+      <w:pPr>
+        <w:rPr>
+          <w:b/>
+        </w:rPr>
+      </w:pPr>
+      <w:r>
+        <w:rPr>
+          <w:b/>
+        </w:rPr>
+        <w:lastRenderedPageBreak/>
+        <w:t>Task 1</w:t>
+      </w:r>
+    </w:p>
     <w:p>
       <w:r>
         <w:t xml:space="preserve"> Module Name: Unique_Brands</w:t>
@@ -433,25 +445,25 @@
         </w:numPr>
       </w:pPr>
       <w:r>
+        <w:t xml:space="preserve">If all brand values are </w:t>
+      </w:r>
+      <w:r>
+        <w:t>None</w:t>
+      </w:r>
+      <w:r>
+        <w:t xml:space="preserve"> or "" , the result is None</w:t>
+      </w:r>
+    </w:p>
+    <w:p>
+      <w:pPr>
+        <w:pStyle w:val="ListParagraph"/>
+        <w:numPr>
+          <w:ilvl w:val="0"/>
+          <w:numId w:val="11"/>
+        </w:numPr>
+      </w:pPr>
+      <w:r>
         <w:lastRenderedPageBreak/>
-        <w:t xml:space="preserve">If all brand values are </w:t>
-      </w:r>
-      <w:r>
-        <w:t>None</w:t>
-      </w:r>
-      <w:r>
-        <w:t xml:space="preserve"> or "" , the result is None</w:t>
-      </w:r>
-    </w:p>
-    <w:p>
-      <w:pPr>
-        <w:pStyle w:val="ListParagraph"/>
-        <w:numPr>
-          <w:ilvl w:val="0"/>
-          <w:numId w:val="11"/>
-        </w:numPr>
-      </w:pPr>
-      <w:r>
         <w:t>If get_all_products /0 re</w:t>
       </w:r>
       <w:r>
@@ -651,40 +663,13 @@
       </w:pPr>
     </w:p>
     <w:p>
-      <w:pPr>
-        <w:pStyle w:val="ListParagraph"/>
-        <w:ind w:left="1800"/>
-      </w:pPr>
-    </w:p>
-    <w:p>
-      <w:pPr>
-        <w:pStyle w:val="ListParagraph"/>
-        <w:ind w:left="1800"/>
-      </w:pPr>
-    </w:p>
-    <w:p>
-      <w:pPr>
-        <w:pStyle w:val="ListParagraph"/>
-        <w:ind w:left="1800"/>
-      </w:pPr>
-    </w:p>
-    <w:p>
-      <w:pPr>
-        <w:pStyle w:val="ListParagraph"/>
-        <w:ind w:left="1800"/>
-      </w:pPr>
-    </w:p>
-    <w:p>
-      <w:pPr>
-        <w:pStyle w:val="ListParagraph"/>
-        <w:ind w:left="1800"/>
-      </w:pPr>
-    </w:p>
-    <w:p>
-      <w:pPr>
-        <w:pStyle w:val="ListParagraph"/>
-        <w:ind w:left="1800"/>
-      </w:pPr>
+      <w:r>
+        <w:rPr>
+          <w:b/>
+        </w:rPr>
+        <w:lastRenderedPageBreak/>
+        <w:t>Task 2</w:t>
+      </w:r>
     </w:p>
     <w:p>
       <w:r>
@@ -1017,36 +1002,36 @@
         </w:numPr>
       </w:pPr>
       <w:r>
+        <w:t>If only one product has a price , returns that price as a float</w:t>
+      </w:r>
+      <w:r>
+        <w:cr/>
+      </w:r>
+      <w:r>
+        <w:t xml:space="preserve"> </w:t>
+      </w:r>
+    </w:p>
+    <w:p>
+      <w:r>
+        <w:t>Example Calls &amp; Expected Outputs</w:t>
+      </w:r>
+    </w:p>
+    <w:p>
+      <w:pPr>
+        <w:pStyle w:val="ListParagraph"/>
+        <w:ind w:left="1080"/>
+      </w:pPr>
+      <w:r>
+        <w:t>1. Normal case with valid brands</w:t>
+      </w:r>
+    </w:p>
+    <w:p>
+      <w:pPr>
+        <w:pStyle w:val="ListParagraph"/>
+        <w:ind w:left="1440"/>
+      </w:pPr>
+      <w:r>
         <w:lastRenderedPageBreak/>
-        <w:t>If only one product has a price , returns that price as a float</w:t>
-      </w:r>
-      <w:r>
-        <w:cr/>
-      </w:r>
-      <w:r>
-        <w:t xml:space="preserve"> </w:t>
-      </w:r>
-    </w:p>
-    <w:p>
-      <w:r>
-        <w:t>Example Calls &amp; Expected Outputs</w:t>
-      </w:r>
-    </w:p>
-    <w:p>
-      <w:pPr>
-        <w:pStyle w:val="ListParagraph"/>
-        <w:ind w:left="1080"/>
-      </w:pPr>
-      <w:r>
-        <w:t>1. Normal case with valid brands</w:t>
-      </w:r>
-    </w:p>
-    <w:p>
-      <w:pPr>
-        <w:pStyle w:val="ListParagraph"/>
-        <w:ind w:left="1440"/>
-      </w:pPr>
-      <w:r>
         <w:t>price_list</w:t>
       </w:r>
       <w:r>
@@ -1379,49 +1364,16 @@
       </w:pPr>
     </w:p>
     <w:p>
-      <w:pPr>
-        <w:pStyle w:val="ListParagraph"/>
-        <w:ind w:left="1800"/>
-      </w:pPr>
-    </w:p>
-    <w:p>
-      <w:pPr>
-        <w:pStyle w:val="ListParagraph"/>
-        <w:ind w:left="1800"/>
-      </w:pPr>
-    </w:p>
-    <w:p>
-      <w:pPr>
-        <w:pStyle w:val="ListParagraph"/>
-        <w:ind w:left="1800"/>
-      </w:pPr>
-    </w:p>
-    <w:p>
-      <w:pPr>
-        <w:pStyle w:val="ListParagraph"/>
-        <w:ind w:left="1800"/>
-      </w:pPr>
-    </w:p>
-    <w:p>
-      <w:pPr>
-        <w:pStyle w:val="ListParagraph"/>
-        <w:ind w:left="1800"/>
-      </w:pPr>
-    </w:p>
-    <w:p>
-      <w:pPr>
-        <w:pStyle w:val="ListParagraph"/>
-        <w:ind w:left="1800"/>
-      </w:pPr>
-    </w:p>
-    <w:p>
-      <w:pPr>
-        <w:pStyle w:val="ListParagraph"/>
-        <w:ind w:left="1800"/>
-      </w:pPr>
-    </w:p>
-    <w:p>
-      <w:r>
+      <w:r>
+        <w:rPr>
+          <w:b/>
+        </w:rPr>
+        <w:t>Task 3</w:t>
+      </w:r>
+    </w:p>
+    <w:p>
+      <w:r>
+        <w:lastRenderedPageBreak/>
         <w:t>Module Name: Get_min_attribute</w:t>
       </w:r>
     </w:p>
@@ -1614,7 +1566,6 @@
         <w:ind w:firstLine="720"/>
       </w:pPr>
       <w:r>
-        <w:lastRenderedPageBreak/>
         <w:t>o</w:t>
       </w:r>
       <w:r>
@@ -1684,6 +1635,7 @@
     </w:p>
     <w:p>
       <w:r>
+        <w:lastRenderedPageBreak/>
         <w:t>Known Edge cases</w:t>
       </w:r>
     </w:p>
@@ -1793,49 +1745,49 @@
     </w:p>
     <w:p>
       <w:r>
+        <w:t xml:space="preserve">    {"battery_life": 2.0}                   </w:t>
+      </w:r>
+    </w:p>
+    <w:p>
+      <w:r>
+        <w:t>], "</w:t>
+      </w:r>
+      <w:r>
+        <w:t>battery_life</w:t>
+      </w:r>
+      <w:r>
+        <w:t>")</w:t>
+      </w:r>
+    </w:p>
+    <w:p>
+      <w:r>
+        <w:t># =&gt; 2.0</w:t>
+      </w:r>
+    </w:p>
+    <w:p/>
+    <w:p>
+      <w:r>
+        <w:t>get_min_2_attributes(data = [</w:t>
+      </w:r>
+    </w:p>
+    <w:p>
+      <w:r>
+        <w:t>    {"price": 49.99, "battery_life": 4.0},</w:t>
+      </w:r>
+    </w:p>
+    <w:p>
+      <w:r>
+        <w:t>    {"price": 29.99, "battery_life": 3.5},</w:t>
+      </w:r>
+    </w:p>
+    <w:p>
+      <w:r>
+        <w:t>    {"price": None, "battery_life": 5.0},  </w:t>
+      </w:r>
+    </w:p>
+    <w:p>
+      <w:r>
         <w:lastRenderedPageBreak/>
-        <w:t xml:space="preserve">    {"battery_life": 2.0}                   </w:t>
-      </w:r>
-    </w:p>
-    <w:p>
-      <w:r>
-        <w:t>], "</w:t>
-      </w:r>
-      <w:r>
-        <w:t>battery_life</w:t>
-      </w:r>
-      <w:r>
-        <w:t>")</w:t>
-      </w:r>
-    </w:p>
-    <w:p>
-      <w:r>
-        <w:t># =&gt; 2.0</w:t>
-      </w:r>
-    </w:p>
-    <w:p/>
-    <w:p>
-      <w:r>
-        <w:t>get_min_2_attributes(data = [</w:t>
-      </w:r>
-    </w:p>
-    <w:p>
-      <w:r>
-        <w:t>    {"price": 49.99, "battery_life": 4.0},</w:t>
-      </w:r>
-    </w:p>
-    <w:p>
-      <w:r>
-        <w:t>    {"price": 29.99, "battery_life": 3.5},</w:t>
-      </w:r>
-    </w:p>
-    <w:p>
-      <w:r>
-        <w:t>    {"price": None, "battery_life": 5.0},  </w:t>
-      </w:r>
-    </w:p>
-    <w:p>
-      <w:r>
         <w:t xml:space="preserve">    {"battery_life": 2.0}                   </w:t>
       </w:r>
     </w:p>
@@ -1981,22 +1933,12 @@
     </w:p>
     <w:p/>
     <w:p>
-      <w:pPr>
-        <w:pStyle w:val="ListParagraph"/>
-        <w:ind w:left="1080"/>
-      </w:pPr>
-    </w:p>
-    <w:p>
-      <w:pPr>
-        <w:pStyle w:val="ListParagraph"/>
-        <w:ind w:left="1080"/>
-      </w:pPr>
-    </w:p>
-    <w:p>
-      <w:pPr>
-        <w:pStyle w:val="ListParagraph"/>
-        <w:ind w:left="1080"/>
-      </w:pPr>
+      <w:r>
+        <w:rPr>
+          <w:b/>
+        </w:rPr>
+        <w:t>Task 4</w:t>
+      </w:r>
     </w:p>
     <w:p>
       <w:pPr>
@@ -2083,6 +2025,7 @@
         </w:numPr>
       </w:pPr>
       <w:r>
+        <w:lastRenderedPageBreak/>
         <w:t>Text as a parameter which takes in a body of text.</w:t>
       </w:r>
     </w:p>
@@ -2265,7 +2208,6 @@
         <w:ind w:left="1080"/>
       </w:pPr>
       <w:r>
-        <w:lastRenderedPageBreak/>
         <w:t xml:space="preserve">1. </w:t>
       </w:r>
       <w:r>
@@ -2535,24 +2477,13 @@
       </w:pPr>
     </w:p>
     <w:p>
-      <w:pPr>
-        <w:pStyle w:val="ListParagraph"/>
-        <w:ind w:left="1080"/>
-      </w:pPr>
-    </w:p>
-    <w:p>
-      <w:pPr>
-        <w:pStyle w:val="ListParagraph"/>
-        <w:ind w:left="1080"/>
-      </w:pPr>
-    </w:p>
-    <w:p>
-      <w:pPr>
-        <w:pStyle w:val="ListParagraph"/>
-        <w:ind w:left="1080"/>
-      </w:pPr>
-    </w:p>
-    <w:p/>
+      <w:r>
+        <w:rPr>
+          <w:b/>
+        </w:rPr>
+        <w:t>Task 5</w:t>
+      </w:r>
+    </w:p>
     <w:p>
       <w:pPr>
         <w:pStyle w:val="ListParagraph"/>
@@ -2620,12 +2551,7 @@
         <w:t>Expected</w:t>
       </w:r>
       <w:r>
-        <w:t xml:space="preserve"> </w:t>
-      </w:r>
-      <w:bookmarkStart w:id="0" w:name="_GoBack"/>
-      <w:bookmarkEnd w:id="0"/>
-      <w:r>
-        <w:t>Inputs</w:t>
+        <w:t xml:space="preserve"> Inputs</w:t>
       </w:r>
       <w:r>
         <w:t>:</w:t>
@@ -2667,6 +2593,7 @@
         </w:numPr>
       </w:pPr>
       <w:r>
+        <w:lastRenderedPageBreak/>
         <w:t>Email</w:t>
       </w:r>
     </w:p>
@@ -2933,7 +2860,6 @@
         </w:numPr>
       </w:pPr>
       <w:r>
-        <w:lastRenderedPageBreak/>
         <w:t>Please T</w:t>
       </w:r>
       <w:r>
@@ -3099,6 +3025,7 @@
         </w:numPr>
       </w:pPr>
       <w:r>
+        <w:lastRenderedPageBreak/>
         <w:t>Error messages are collected as a list and multiple error messages are appended into that list.</w:t>
       </w:r>
     </w:p>
@@ -3286,7 +3213,6 @@
         <w:ind w:left="1080" w:right="-563"/>
       </w:pPr>
       <w:r>
-        <w:lastRenderedPageBreak/>
         <w:t xml:space="preserve">2. </w:t>
       </w:r>
       <w:r>
@@ -3386,12 +3312,15 @@
     <w:p/>
     <w:p>
       <w:pPr>
-        <w:tabs>
-          <w:tab w:val="left" w:pos="3909"/>
-        </w:tabs>
-      </w:pPr>
-      <w:r>
-        <w:tab/>
+        <w:rPr>
+          <w:b/>
+        </w:rPr>
+      </w:pPr>
+      <w:r>
+        <w:rPr>
+          <w:b/>
+        </w:rPr>
+        <w:t>Task 6</w:t>
       </w:r>
     </w:p>
     <w:p>
@@ -3442,6 +3371,7 @@
         </w:numPr>
       </w:pPr>
       <w:r>
+        <w:lastRenderedPageBreak/>
         <w:t>Validates the strength and presence of a user ’s password in an Ecto changeset .</w:t>
       </w:r>
     </w:p>
@@ -3661,7 +3591,6 @@
         </w:numPr>
       </w:pPr>
       <w:r>
-        <w:lastRenderedPageBreak/>
         <w:t xml:space="preserve">password must be a string between </w:t>
       </w:r>
       <w:r>
@@ -3862,6 +3791,7 @@
         </w:numPr>
       </w:pPr>
       <w:r>
+        <w:lastRenderedPageBreak/>
         <w:t>Password must contain a lowercase letter</w:t>
       </w:r>
     </w:p>
@@ -3966,7 +3896,12 @@
         <w:t xml:space="preserve"># =&gt; </w:t>
       </w:r>
       <w:r>
-        <w:t>['Length must be between 12 and 72 characters', 'Password must contain an uppercase letter', 'Password must contain a special character or a number']</w:t>
+        <w:t xml:space="preserve">['Length must be between 12 and 72 characters', 'Password must contain an </w:t>
+      </w:r>
+      <w:bookmarkStart w:id="0" w:name="_GoBack"/>
+      <w:bookmarkEnd w:id="0"/>
+      <w:r>
+        <w:t>uppercase letter', 'Password must contain a special character or a number']</w:t>
       </w:r>
     </w:p>
     <w:p>
@@ -4088,6 +4023,19 @@
         <w:pStyle w:val="ListParagraph"/>
         <w:ind w:left="1080"/>
       </w:pPr>
+    </w:p>
+    <w:p>
+      <w:pPr>
+        <w:rPr>
+          <w:b/>
+        </w:rPr>
+      </w:pPr>
+      <w:r>
+        <w:rPr>
+          <w:b/>
+        </w:rPr>
+        <w:t>Task 7</w:t>
+      </w:r>
     </w:p>
     <w:p>
       <w:pPr>
@@ -4142,6 +4090,7 @@
     </w:p>
     <w:p>
       <w:r>
+        <w:lastRenderedPageBreak/>
         <w:t>Purpose</w:t>
       </w:r>
     </w:p>
@@ -4344,7 +4293,6 @@
     </w:p>
     <w:p>
       <w:r>
-        <w:lastRenderedPageBreak/>
         <w:t>Example Calls &amp; Expected Outputs</w:t>
       </w:r>
     </w:p>
@@ -4714,6 +4662,19 @@
     </w:p>
     <w:p>
       <w:pPr>
+        <w:rPr>
+          <w:b/>
+        </w:rPr>
+      </w:pPr>
+      <w:r>
+        <w:rPr>
+          <w:b/>
+        </w:rPr>
+        <w:t>Task 8</w:t>
+      </w:r>
+    </w:p>
+    <w:p>
+      <w:pPr>
         <w:pStyle w:val="ListParagraph"/>
         <w:ind w:left="1080"/>
       </w:pPr>
@@ -4788,6 +4749,7 @@
         </w:numPr>
       </w:pPr>
       <w:r>
+        <w:lastRenderedPageBreak/>
         <w:t>Converts any given string into a URL - friendly slug by transliterating Unicode characters into their alphanumeric equivalents .</w:t>
       </w:r>
       <w:r>
@@ -4981,189 +4943,206 @@
         </w:numPr>
       </w:pPr>
       <w:r>
+        <w:t xml:space="preserve">Returns </w:t>
+      </w:r>
+      <w:r>
+        <w:t>None</w:t>
+      </w:r>
+      <w:r>
+        <w:t xml:space="preserve"> if no valid slug can be generated (e.g .input contains only invalid characters ).</w:t>
+      </w:r>
+    </w:p>
+    <w:p>
+      <w:r>
+        <w:t>Constraints</w:t>
+      </w:r>
+    </w:p>
+    <w:p>
+      <w:pPr>
+        <w:pStyle w:val="ListParagraph"/>
+        <w:numPr>
+          <w:ilvl w:val="0"/>
+          <w:numId w:val="10"/>
+        </w:numPr>
+      </w:pPr>
+      <w:r>
+        <w:t>Slug must include only alphanumeric characters and the</w:t>
+      </w:r>
+      <w:r>
+        <w:t xml:space="preserve"> </w:t>
+      </w:r>
+      <w:r>
+        <w:t xml:space="preserve">configured separator . </w:t>
+      </w:r>
+    </w:p>
+    <w:p>
+      <w:pPr>
+        <w:pStyle w:val="ListParagraph"/>
+        <w:numPr>
+          <w:ilvl w:val="0"/>
+          <w:numId w:val="10"/>
+        </w:numPr>
+      </w:pPr>
+      <w:r>
+        <w:t>Characters listed in : ignore remain unchanged in the output .</w:t>
+      </w:r>
+    </w:p>
+    <w:p>
+      <w:pPr>
+        <w:pStyle w:val="ListParagraph"/>
+        <w:numPr>
+          <w:ilvl w:val="0"/>
+          <w:numId w:val="10"/>
+        </w:numPr>
+      </w:pPr>
+      <w:r>
+        <w:t>Punctuation is removed unless explicitly preserved via :ignore .</w:t>
+      </w:r>
+    </w:p>
+    <w:p>
+      <w:pPr>
+        <w:pStyle w:val="ListParagraph"/>
+        <w:numPr>
+          <w:ilvl w:val="0"/>
+          <w:numId w:val="10"/>
+        </w:numPr>
+      </w:pPr>
+      <w:r>
+        <w:t>Input must be valid UTF -8</w:t>
+      </w:r>
+    </w:p>
+    <w:p/>
+    <w:p>
+      <w:r>
+        <w:t>Known Edge Cases</w:t>
+      </w:r>
+    </w:p>
+    <w:p>
+      <w:pPr>
+        <w:pStyle w:val="ListParagraph"/>
+        <w:numPr>
+          <w:ilvl w:val="0"/>
+          <w:numId w:val="3"/>
+        </w:numPr>
+      </w:pPr>
+      <w:r>
+        <w:t xml:space="preserve">Empty input or punctuation - only input =&gt; returns </w:t>
+      </w:r>
+      <w:r>
+        <w:t>None</w:t>
+      </w:r>
+    </w:p>
+    <w:p>
+      <w:pPr>
+        <w:pStyle w:val="ListParagraph"/>
+        <w:numPr>
+          <w:ilvl w:val="0"/>
+          <w:numId w:val="3"/>
+        </w:numPr>
+      </w:pPr>
+      <w:r>
         <w:lastRenderedPageBreak/>
-        <w:t xml:space="preserve">Returns </w:t>
-      </w:r>
-      <w:r>
-        <w:t>None</w:t>
-      </w:r>
-      <w:r>
-        <w:t xml:space="preserve"> if no valid slug can be generated (e.g .input contains only invalid characters ).</w:t>
-      </w:r>
-    </w:p>
-    <w:p>
-      <w:r>
-        <w:t>Constraints</w:t>
-      </w:r>
-    </w:p>
-    <w:p>
-      <w:pPr>
-        <w:pStyle w:val="ListParagraph"/>
-        <w:numPr>
-          <w:ilvl w:val="0"/>
-          <w:numId w:val="10"/>
-        </w:numPr>
-      </w:pPr>
-      <w:r>
-        <w:t>Slug must include only alphanumeric characters and the</w:t>
-      </w:r>
-      <w:r>
-        <w:t xml:space="preserve"> </w:t>
-      </w:r>
-      <w:r>
-        <w:t xml:space="preserve">configured separator . </w:t>
-      </w:r>
-    </w:p>
-    <w:p>
-      <w:pPr>
-        <w:pStyle w:val="ListParagraph"/>
-        <w:numPr>
-          <w:ilvl w:val="0"/>
-          <w:numId w:val="10"/>
-        </w:numPr>
-      </w:pPr>
-      <w:r>
-        <w:t>Characters listed in : ignore remain unchanged in the output .</w:t>
-      </w:r>
-    </w:p>
-    <w:p>
-      <w:pPr>
-        <w:pStyle w:val="ListParagraph"/>
-        <w:numPr>
-          <w:ilvl w:val="0"/>
-          <w:numId w:val="10"/>
-        </w:numPr>
-      </w:pPr>
-      <w:r>
-        <w:t>Punctuation is removed unless explicitly preserved via :ignore .</w:t>
-      </w:r>
-    </w:p>
-    <w:p>
-      <w:pPr>
-        <w:pStyle w:val="ListParagraph"/>
-        <w:numPr>
-          <w:ilvl w:val="0"/>
-          <w:numId w:val="10"/>
-        </w:numPr>
-      </w:pPr>
-      <w:r>
-        <w:t>Input must be valid UTF -8</w:t>
+        <w:t>Very small : truncate values (e .g., 1 or 2) may eliminate all words if none fit .</w:t>
+      </w:r>
+      <w:r>
+        <w:cr/>
+      </w:r>
+    </w:p>
+    <w:p>
+      <w:pPr>
+        <w:pStyle w:val="ListParagraph"/>
+        <w:numPr>
+          <w:ilvl w:val="0"/>
+          <w:numId w:val="3"/>
+        </w:numPr>
+      </w:pPr>
+      <w:r>
+        <w:t>Leading / trailing and repeated whitespace =&gt; cleaned up .</w:t>
+      </w:r>
+    </w:p>
+    <w:p>
+      <w:pPr>
+        <w:pStyle w:val="ListParagraph"/>
+        <w:ind w:left="1440"/>
+      </w:pPr>
+      <w:r>
+        <w:t>Example : " foo bar " =&gt; " foo - bar ".</w:t>
+      </w:r>
+    </w:p>
+    <w:p>
+      <w:pPr>
+        <w:pStyle w:val="ListParagraph"/>
+        <w:numPr>
+          <w:ilvl w:val="0"/>
+          <w:numId w:val="3"/>
+        </w:numPr>
+      </w:pPr>
+      <w:r>
+        <w:t>Mixed - language input =&gt; transliterated where possible ( e.g.,</w:t>
+      </w:r>
+    </w:p>
+    <w:p>
+      <w:pPr>
+        <w:pStyle w:val="ListParagraph"/>
+        <w:ind w:left="1440"/>
+      </w:pPr>
+      <w:r>
+        <w:t>"\ u4f60 \ u597d " =&gt; "ni - hao " unless ignored ) .</w:t>
+      </w:r>
+    </w:p>
+    <w:p>
+      <w:pPr>
+        <w:pStyle w:val="ListParagraph"/>
+        <w:numPr>
+          <w:ilvl w:val="0"/>
+          <w:numId w:val="3"/>
+        </w:numPr>
+      </w:pPr>
+      <w:r>
+        <w:t>Very small : truncate values (e .g., 1 or 2) may eliminate all</w:t>
+      </w:r>
+    </w:p>
+    <w:p>
+      <w:pPr>
+        <w:pStyle w:val="ListParagraph"/>
+        <w:ind w:left="1440"/>
+      </w:pPr>
+      <w:r>
+        <w:t>words if none fit</w:t>
       </w:r>
     </w:p>
     <w:p/>
     <w:p>
       <w:r>
-        <w:t>Known Edge Cases</w:t>
-      </w:r>
-    </w:p>
-    <w:p>
-      <w:pPr>
-        <w:pStyle w:val="ListParagraph"/>
-        <w:numPr>
-          <w:ilvl w:val="0"/>
-          <w:numId w:val="3"/>
-        </w:numPr>
-      </w:pPr>
-      <w:r>
-        <w:t xml:space="preserve">Empty input or punctuation - only input =&gt; returns </w:t>
-      </w:r>
-      <w:r>
-        <w:t>None</w:t>
-      </w:r>
-    </w:p>
-    <w:p>
-      <w:pPr>
-        <w:pStyle w:val="ListParagraph"/>
-        <w:numPr>
-          <w:ilvl w:val="0"/>
-          <w:numId w:val="3"/>
-        </w:numPr>
-      </w:pPr>
-      <w:r>
-        <w:t>Very small : truncate values (e .g., 1 or 2) may eliminate all words if none fit .</w:t>
+        <w:t>Example Calls &amp; Expected Outputs</w:t>
+      </w:r>
+    </w:p>
+    <w:p>
+      <w:r>
+        <w:t>slugify_manual</w:t>
+      </w:r>
+      <w:r>
+        <w:t>(</w:t>
+      </w:r>
+      <w:r>
+        <w:t>" Hello , World !"</w:t>
+      </w:r>
+      <w:r>
+        <w:t>)</w:t>
+      </w:r>
+    </w:p>
+    <w:p>
+      <w:r>
+        <w:t># =&gt; " hello - world "</w:t>
       </w:r>
       <w:r>
         <w:cr/>
       </w:r>
-    </w:p>
-    <w:p>
-      <w:pPr>
-        <w:pStyle w:val="ListParagraph"/>
-        <w:numPr>
-          <w:ilvl w:val="0"/>
-          <w:numId w:val="3"/>
-        </w:numPr>
-      </w:pPr>
-      <w:r>
-        <w:t>Leading / trailing and repeated whitespace =&gt; cleaned up .</w:t>
-      </w:r>
-    </w:p>
-    <w:p>
-      <w:pPr>
-        <w:pStyle w:val="ListParagraph"/>
-        <w:ind w:left="1440"/>
-      </w:pPr>
-      <w:r>
-        <w:t>Example : " foo bar " =&gt; " foo - bar ".</w:t>
-      </w:r>
-    </w:p>
-    <w:p>
-      <w:pPr>
-        <w:pStyle w:val="ListParagraph"/>
-        <w:numPr>
-          <w:ilvl w:val="0"/>
-          <w:numId w:val="3"/>
-        </w:numPr>
-      </w:pPr>
-      <w:r>
-        <w:t>Mixed - language input =&gt; transliterated where possible ( e.g.,</w:t>
-      </w:r>
-    </w:p>
-    <w:p>
-      <w:pPr>
-        <w:pStyle w:val="ListParagraph"/>
-        <w:ind w:left="1440"/>
-      </w:pPr>
-      <w:r>
-        <w:t>"\ u4f60 \ u597d " =&gt; "ni - hao " unless ignored ) .</w:t>
-      </w:r>
-    </w:p>
-    <w:p>
-      <w:pPr>
-        <w:pStyle w:val="ListParagraph"/>
-        <w:numPr>
-          <w:ilvl w:val="0"/>
-          <w:numId w:val="3"/>
-        </w:numPr>
-      </w:pPr>
-      <w:r>
-        <w:t>Very small : truncate values (e .g., 1 or 2) may eliminate all</w:t>
-      </w:r>
-    </w:p>
-    <w:p>
-      <w:pPr>
-        <w:pStyle w:val="ListParagraph"/>
-        <w:ind w:left="1440"/>
-      </w:pPr>
-      <w:r>
-        <w:t>words if none fit</w:t>
-      </w:r>
-    </w:p>
-    <w:p/>
-    <w:p>
-      <w:r>
-        <w:t>Example Calls &amp; Expected Outputs</w:t>
-      </w:r>
-    </w:p>
-    <w:p>
-      <w:r>
-        <w:t>slugify_manual</w:t>
-      </w:r>
-      <w:r>
-        <w:t>(</w:t>
-      </w:r>
-      <w:r>
-        <w:t>" Hello , World !"</w:t>
+      <w:r>
+        <w:t>slugify_manual(</w:t>
+      </w:r>
+      <w:r>
+        <w:t>" Madam , I ’m Adam ", separator : ""</w:t>
       </w:r>
       <w:r>
         <w:t>)</w:t>
@@ -5171,37 +5150,20 @@
     </w:p>
     <w:p>
       <w:r>
-        <w:t># =&gt; " hello - world "</w:t>
+        <w:t># =&gt; " madamimadam "</w:t>
+      </w:r>
+    </w:p>
+    <w:p>
+      <w:r>
+        <w:t>slugify_manual(</w:t>
+      </w:r>
+      <w:r>
+        <w:t>" StUdLy CaPs ", lowercase : false )</w:t>
       </w:r>
       <w:r>
         <w:cr/>
       </w:r>
       <w:r>
-        <w:t>slugify_manual(</w:t>
-      </w:r>
-      <w:r>
-        <w:t>" Madam , I ’m Adam ", separator : ""</w:t>
-      </w:r>
-      <w:r>
-        <w:t>)</w:t>
-      </w:r>
-    </w:p>
-    <w:p>
-      <w:r>
-        <w:t># =&gt; " madamimadam "</w:t>
-      </w:r>
-    </w:p>
-    <w:p>
-      <w:r>
-        <w:t>slugify_manual(</w:t>
-      </w:r>
-      <w:r>
-        <w:t>" StUdLy CaPs ", lowercase : false )</w:t>
-      </w:r>
-      <w:r>
-        <w:cr/>
-      </w:r>
-      <w:r>
         <w:t># =&gt; " StUdLy - CaPs "</w:t>
       </w:r>
     </w:p>
@@ -5227,7 +5189,6 @@
     </w:p>
     <w:p>
       <w:r>
-        <w:lastRenderedPageBreak/>
         <w:tab/>
         <w:t xml:space="preserve"> </w:t>
       </w:r>
@@ -5274,7 +5235,19 @@
         <w:ind w:left="1080"/>
       </w:pPr>
     </w:p>
-    <w:p/>
+    <w:p>
+      <w:pPr>
+        <w:rPr>
+          <w:b/>
+        </w:rPr>
+      </w:pPr>
+      <w:r>
+        <w:rPr>
+          <w:b/>
+        </w:rPr>
+        <w:t>Task 9</w:t>
+      </w:r>
+    </w:p>
     <w:p>
       <w:pPr>
         <w:pStyle w:val="ListParagraph"/>
@@ -5296,6 +5269,7 @@
         <w:ind w:right="-705"/>
       </w:pPr>
       <w:r>
+        <w:lastRenderedPageBreak/>
         <w:t>Class/Function:</w:t>
       </w:r>
     </w:p>
@@ -5483,7 +5457,6 @@
         </w:numPr>
       </w:pPr>
       <w:r>
-        <w:lastRenderedPageBreak/>
         <w:t>Key :</w:t>
       </w:r>
       <w:r>
@@ -5611,6 +5584,7 @@
         </w:numPr>
       </w:pPr>
       <w:r>
+        <w:lastRenderedPageBreak/>
         <w:t>If a requested key doesn ’ t exist</w:t>
       </w:r>
       <w:r>
@@ -5783,7 +5757,6 @@
     </w:p>
     <w:p>
       <w:r>
-        <w:lastRenderedPageBreak/>
         <w:t>Cache.</w:t>
       </w:r>
       <w:r>
@@ -5874,6 +5847,7 @@
     </w:p>
     <w:p>
       <w:r>
+        <w:lastRenderedPageBreak/>
         <w:t>#=&gt; deleted successfully</w:t>
       </w:r>
     </w:p>

</xml_diff>

<commit_message>
editted test manual implemnetation
</commit_message>
<xml_diff>
--- a/Prompts/Prompts_OpenAI.docx
+++ b/Prompts/Prompts_OpenAI.docx
@@ -2511,10 +2511,16 @@
         <w:t xml:space="preserve"> </w:t>
       </w:r>
       <w:r>
-        <w:t>Validate</w:t>
+        <w:t>v</w:t>
+      </w:r>
+      <w:r>
+        <w:t>alidate</w:t>
       </w:r>
       <w:r>
         <w:t>_form</w:t>
+      </w:r>
+      <w:r>
+        <w:t>()</w:t>
       </w:r>
     </w:p>
     <w:p>
@@ -3231,13 +3237,7 @@
         <w:t>validate_form("Alex"</w:t>
       </w:r>
       <w:r>
-        <w:t>,”</w:t>
-      </w:r>
-      <w:r>
-        <w:t xml:space="preserve"> </w:t>
-      </w:r>
-      <w:r>
-        <w:t>John”</w:t>
+        <w:t>,”John”</w:t>
       </w:r>
       <w:r>
         <w:t>,"abc@gmail.net","Question","Hallo!",False)</w:t>
@@ -3351,7 +3351,16 @@
         <w:t xml:space="preserve"> </w:t>
       </w:r>
       <w:r>
-        <w:t>IsValidPassword</w:t>
+        <w:t>is_v</w:t>
+      </w:r>
+      <w:r>
+        <w:t>alid</w:t>
+      </w:r>
+      <w:r>
+        <w:t>_p</w:t>
+      </w:r>
+      <w:r>
+        <w:t>assword</w:t>
       </w:r>
       <w:r>
         <w:t>()</w:t>
@@ -3359,6 +3368,12 @@
     </w:p>
     <w:p>
       <w:r>
+        <w:t xml:space="preserve"> </w:t>
+      </w:r>
+    </w:p>
+    <w:p>
+      <w:r>
+        <w:lastRenderedPageBreak/>
         <w:t>Purpose</w:t>
       </w:r>
     </w:p>
@@ -3371,7 +3386,6 @@
         </w:numPr>
       </w:pPr>
       <w:r>
-        <w:lastRenderedPageBreak/>
         <w:t>Validates the strength and presence of a user ’s password in an Ecto changeset .</w:t>
       </w:r>
     </w:p>
@@ -3764,6 +3778,7 @@
         </w:numPr>
       </w:pPr>
       <w:r>
+        <w:lastRenderedPageBreak/>
         <w:t xml:space="preserve">If </w:t>
       </w:r>
       <w:r>
@@ -3791,7 +3806,6 @@
         </w:numPr>
       </w:pPr>
       <w:r>
-        <w:lastRenderedPageBreak/>
         <w:t>Password must contain a lowercase letter</w:t>
       </w:r>
     </w:p>
@@ -3841,7 +3855,6 @@
     </w:p>
     <w:p>
       <w:pPr>
-        <w:pStyle w:val="ListParagraph"/>
         <w:ind w:left="1080"/>
       </w:pPr>
       <w:r>
@@ -3854,7 +3867,25 @@
         <w:cr/>
       </w:r>
       <w:r>
-        <w:t xml:space="preserve"> IsValidPassword("")</w:t>
+        <w:t xml:space="preserve"> </w:t>
+      </w:r>
+      <w:r>
+        <w:t>is_v</w:t>
+      </w:r>
+      <w:r>
+        <w:t>alid</w:t>
+      </w:r>
+      <w:r>
+        <w:t>_p</w:t>
+      </w:r>
+      <w:r>
+        <w:t>assword</w:t>
+      </w:r>
+      <w:r>
+        <w:t xml:space="preserve"> </w:t>
+      </w:r>
+      <w:r>
+        <w:t>("")</w:t>
       </w:r>
     </w:p>
     <w:p>
@@ -3896,12 +3927,7 @@
         <w:t xml:space="preserve"># =&gt; </w:t>
       </w:r>
       <w:r>
-        <w:t xml:space="preserve">['Length must be between 12 and 72 characters', 'Password must contain an </w:t>
-      </w:r>
-      <w:bookmarkStart w:id="0" w:name="_GoBack"/>
-      <w:bookmarkEnd w:id="0"/>
-      <w:r>
-        <w:t>uppercase letter', 'Password must contain a special character or a number']</w:t>
+        <w:t>['Length must be between 12 and 72 characters', 'Password must contain an uppercase letter', 'Password must contain a special character or a number']</w:t>
       </w:r>
     </w:p>
     <w:p>
@@ -4063,6 +4089,7 @@
     </w:p>
     <w:p>
       <w:r>
+        <w:lastRenderedPageBreak/>
         <w:t xml:space="preserve">Module Name: </w:t>
       </w:r>
       <w:r>
@@ -4087,10 +4114,14 @@
       <w:r>
         <w:t>shopping_list</w:t>
       </w:r>
-    </w:p>
-    <w:p>
-      <w:r>
-        <w:lastRenderedPageBreak/>
+      <w:r>
+        <w:t>()</w:t>
+      </w:r>
+      <w:bookmarkStart w:id="0" w:name="_GoBack"/>
+      <w:bookmarkEnd w:id="0"/>
+    </w:p>
+    <w:p>
+      <w:r>
         <w:t>Purpose</w:t>
       </w:r>
     </w:p>
@@ -4492,6 +4523,7 @@
     </w:p>
     <w:p>
       <w:r>
+        <w:lastRenderedPageBreak/>
         <w:tab/>
       </w:r>
       <w:r>
@@ -4715,6 +4747,7 @@
     </w:p>
     <w:p>
       <w:r>
+        <w:lastRenderedPageBreak/>
         <w:t>Function_Name:</w:t>
       </w:r>
       <w:r>
@@ -4749,7 +4782,6 @@
         </w:numPr>
       </w:pPr>
       <w:r>
-        <w:lastRenderedPageBreak/>
         <w:t>Converts any given string into a URL - friendly slug by transliterating Unicode characters into their alphanumeric equivalents .</w:t>
       </w:r>
       <w:r>
@@ -5026,6 +5058,7 @@
         </w:numPr>
       </w:pPr>
       <w:r>
+        <w:lastRenderedPageBreak/>
         <w:t xml:space="preserve">Empty input or punctuation - only input =&gt; returns </w:t>
       </w:r>
       <w:r>
@@ -5041,7 +5074,6 @@
         </w:numPr>
       </w:pPr>
       <w:r>
-        <w:lastRenderedPageBreak/>
         <w:t>Very small : truncate values (e .g., 1 or 2) may eliminate all words if none fit .</w:t>
       </w:r>
       <w:r>
@@ -5261,6 +5293,7 @@
         </w:rPr>
       </w:pPr>
       <w:r>
+        <w:lastRenderedPageBreak/>
         <w:t>Module Name: product_cache</w:t>
       </w:r>
     </w:p>
@@ -5269,7 +5302,6 @@
         <w:ind w:right="-705"/>
       </w:pPr>
       <w:r>
-        <w:lastRenderedPageBreak/>
         <w:t>Class/Function:</w:t>
       </w:r>
     </w:p>
@@ -5572,6 +5604,7 @@
     </w:p>
     <w:p>
       <w:r>
+        <w:lastRenderedPageBreak/>
         <w:t>Known Edge cases</w:t>
       </w:r>
     </w:p>
@@ -5584,7 +5617,6 @@
         </w:numPr>
       </w:pPr>
       <w:r>
-        <w:lastRenderedPageBreak/>
         <w:t>If a requested key doesn ’ t exist</w:t>
       </w:r>
       <w:r>
@@ -5833,6 +5865,7 @@
     <w:p/>
     <w:p>
       <w:r>
+        <w:lastRenderedPageBreak/>
         <w:t xml:space="preserve">6. </w:t>
       </w:r>
       <w:r>
@@ -5847,7 +5880,6 @@
     </w:p>
     <w:p>
       <w:r>
-        <w:lastRenderedPageBreak/>
         <w:t>#=&gt; deleted successfully</w:t>
       </w:r>
     </w:p>

</xml_diff>